<commit_message>
XHI, SSC documentation added
</commit_message>
<xml_diff>
--- a/src/MCA/screenshots/Doc1.docx
+++ b/src/MCA/screenshots/Doc1.docx
@@ -19,6 +19,15 @@
     </w:p>
     <w:sdt>
       <w:sdtPr>
+        <w:rPr>
+          <w:rFonts w:asciiTheme="minorHAnsi" w:eastAsiaTheme="minorHAnsi" w:hAnsiTheme="minorHAnsi" w:cstheme="minorBidi"/>
+          <w:color w:val="auto"/>
+          <w:kern w:val="2"/>
+          <w:sz w:val="24"/>
+          <w:szCs w:val="24"/>
+          <w:lang w:val="en-IN"/>
+          <w14:ligatures w14:val="standardContextual"/>
+        </w:rPr>
         <w:id w:val="-1546901747"/>
         <w:docPartObj>
           <w:docPartGallery w:val="Table of Contents"/>
@@ -27,16 +36,9 @@
       </w:sdtPr>
       <w:sdtEndPr>
         <w:rPr>
-          <w:rFonts w:asciiTheme="minorHAnsi" w:eastAsiaTheme="minorHAnsi" w:hAnsiTheme="minorHAnsi" w:cstheme="minorBidi"/>
           <w:b/>
           <w:bCs/>
           <w:noProof/>
-          <w:color w:val="auto"/>
-          <w:kern w:val="2"/>
-          <w:sz w:val="24"/>
-          <w:szCs w:val="24"/>
-          <w:lang w:val="en-IN"/>
-          <w14:ligatures w14:val="standardContextual"/>
         </w:rPr>
       </w:sdtEndPr>
       <w:sdtContent>
@@ -822,6 +824,9 @@
         </mc:AlternateContent>
       </w:r>
       <w:r>
+        <w:rPr>
+          <w:noProof/>
+        </w:rPr>
         <w:drawing>
           <wp:inline distT="0" distB="0" distL="0" distR="0" wp14:anchorId="0697DE5C" wp14:editId="0B3A30EA">
             <wp:extent cx="5106113" cy="2819794"/>
@@ -1025,6 +1030,9 @@
         </mc:AlternateContent>
       </w:r>
       <w:r>
+        <w:rPr>
+          <w:noProof/>
+        </w:rPr>
         <w:drawing>
           <wp:inline distT="0" distB="0" distL="0" distR="0" wp14:anchorId="4CB4A253" wp14:editId="48C42737">
             <wp:extent cx="5430008" cy="4972744"/>
@@ -1097,7 +1105,15 @@
       </w:pPr>
       <w:r>
         <w:lastRenderedPageBreak/>
-        <w:t xml:space="preserve">Open CGM Aprima app from desktop </w:t>
+        <w:t xml:space="preserve">Open CGM </w:t>
+      </w:r>
+      <w:proofErr w:type="spellStart"/>
+      <w:r>
+        <w:t>Aprima</w:t>
+      </w:r>
+      <w:proofErr w:type="spellEnd"/>
+      <w:r>
+        <w:t xml:space="preserve"> app from desktop </w:t>
       </w:r>
     </w:p>
     <w:p>
@@ -1234,11 +1250,11 @@
         <w:t>Login with valid password to application</w:t>
       </w:r>
     </w:p>
+    <w:bookmarkStart w:id="2" w:name="_Toc225774501"/>
     <w:p>
       <w:pPr>
         <w:pStyle w:val="Heading2"/>
       </w:pPr>
-      <w:bookmarkStart w:id="2" w:name="_Toc225774501"/>
       <w:r>
         <w:rPr>
           <w:noProof/>
@@ -1897,7 +1913,23 @@
         </w:numPr>
       </w:pPr>
       <w:r>
-        <w:t>Navigate to Reports &gt; Reports &gt; Clinical Quality &gt; Patient With Visits By Insurance</w:t>
+        <w:t xml:space="preserve">Navigate to Reports &gt; Reports &gt; Clinical Quality &gt; Patient </w:t>
+      </w:r>
+      <w:proofErr w:type="gramStart"/>
+      <w:r>
+        <w:t>With</w:t>
+      </w:r>
+      <w:proofErr w:type="gramEnd"/>
+      <w:r>
+        <w:t xml:space="preserve"> Visits </w:t>
+      </w:r>
+      <w:proofErr w:type="gramStart"/>
+      <w:r>
+        <w:t>By</w:t>
+      </w:r>
+      <w:proofErr w:type="gramEnd"/>
+      <w:r>
+        <w:t xml:space="preserve"> Insurance</w:t>
       </w:r>
     </w:p>
     <w:p>
@@ -3227,13 +3259,15 @@
       </w:pPr>
       <w:r>
         <w:lastRenderedPageBreak/>
-        <w:t xml:space="preserve"> </w:t>
-      </w:r>
-      <w:r>
-        <w:t>Navigate to Reports &gt; Reports &gt; General Reports</w:t>
-      </w:r>
-      <w:r>
-        <w:t xml:space="preserve"> &gt; Patients By Insurance</w:t>
+        <w:t xml:space="preserve"> Navigate to Reports &gt; Reports &gt; General Reports &gt; Patients </w:t>
+      </w:r>
+      <w:proofErr w:type="gramStart"/>
+      <w:r>
+        <w:t>By</w:t>
+      </w:r>
+      <w:proofErr w:type="gramEnd"/>
+      <w:r>
+        <w:t xml:space="preserve"> Insurance</w:t>
       </w:r>
     </w:p>
     <w:p>
@@ -3449,7 +3483,15 @@
         </w:numPr>
       </w:pPr>
       <w:r>
-        <w:t xml:space="preserve"> Apply the filter as shown below, (all accounts, Effective Date Range – past 1 year, exclude, inactive, exclude deceased patients**** (This is important filter) ) and click on view, then the report will open in new tab, export the report as excel</w:t>
+        <w:t xml:space="preserve"> Apply the filter as shown below, (all accounts, Effective Date Range – past 1 year, exclude, inactive, exclude deceased patients**** (This is important filter</w:t>
+      </w:r>
+      <w:proofErr w:type="gramStart"/>
+      <w:r>
+        <w:t>) )</w:t>
+      </w:r>
+      <w:proofErr w:type="gramEnd"/>
+      <w:r>
+        <w:t xml:space="preserve"> and click on view, then the report will open in new tab, export the report as excel</w:t>
       </w:r>
     </w:p>
     <w:p>
@@ -4215,13 +4257,15 @@
         </w:numPr>
       </w:pPr>
       <w:r>
-        <w:t xml:space="preserve"> </w:t>
-      </w:r>
-      <w:r>
-        <w:t>Navigate to Reports &gt; Reports &gt; Clinical</w:t>
-      </w:r>
-      <w:r>
-        <w:t xml:space="preserve"> &gt; Patient By Diagnosis and apply as shown in filter,</w:t>
+        <w:t xml:space="preserve"> Navigate to Reports &gt; Reports &gt; Clinical &gt; Patient </w:t>
+      </w:r>
+      <w:proofErr w:type="gramStart"/>
+      <w:r>
+        <w:t>By</w:t>
+      </w:r>
+      <w:proofErr w:type="gramEnd"/>
+      <w:r>
+        <w:t xml:space="preserve"> Diagnosis and apply as shown in filter,</w:t>
       </w:r>
       <w:r>
         <w:t xml:space="preserve"> and click on view, then the report will open in new tab, export the report as excel</w:t>
@@ -4238,107 +4282,27 @@
         <mc:AlternateContent>
           <mc:Choice Requires="wps">
             <w:drawing>
-              <wp:anchor distT="0" distB="0" distL="114300" distR="114300" simplePos="0" relativeHeight="251727872" behindDoc="0" locked="0" layoutInCell="1" allowOverlap="1" wp14:anchorId="01CF7699" wp14:editId="66C2B9FE">
+              <wp:anchor distT="0" distB="0" distL="114300" distR="114300" simplePos="0" relativeHeight="251793408" behindDoc="0" locked="0" layoutInCell="1" allowOverlap="1" wp14:anchorId="6E850855" wp14:editId="397B3931">
                 <wp:simplePos x="0" y="0"/>
-                <wp:positionH relativeFrom="margin">
-                  <wp:posOffset>1889760</wp:posOffset>
+                <wp:positionH relativeFrom="column">
+                  <wp:posOffset>2228215</wp:posOffset>
                 </wp:positionH>
                 <wp:positionV relativeFrom="paragraph">
-                  <wp:posOffset>333375</wp:posOffset>
+                  <wp:posOffset>1436370</wp:posOffset>
                 </wp:positionV>
-                <wp:extent cx="350520" cy="220980"/>
-                <wp:effectExtent l="0" t="0" r="11430" b="26670"/>
+                <wp:extent cx="1297305" cy="464185"/>
+                <wp:effectExtent l="57150" t="76200" r="93345" b="88265"/>
                 <wp:wrapNone/>
-                <wp:docPr id="1686373304" name="Rectangle 6"/>
-                <wp:cNvGraphicFramePr/>
-                <a:graphic xmlns:a="http://schemas.openxmlformats.org/drawingml/2006/main">
-                  <a:graphicData uri="http://schemas.microsoft.com/office/word/2010/wordprocessingShape">
-                    <wps:wsp>
-                      <wps:cNvSpPr/>
-                      <wps:spPr>
-                        <a:xfrm>
-                          <a:off x="0" y="0"/>
-                          <a:ext cx="350520" cy="220980"/>
-                        </a:xfrm>
-                        <a:prstGeom prst="rect">
-                          <a:avLst/>
-                        </a:prstGeom>
-                        <a:noFill/>
-                        <a:ln w="25400">
-                          <a:solidFill>
-                            <a:srgbClr val="EE0000"/>
-                          </a:solidFill>
-                        </a:ln>
-                      </wps:spPr>
-                      <wps:style>
-                        <a:lnRef idx="2">
-                          <a:schemeClr val="dk1"/>
-                        </a:lnRef>
-                        <a:fillRef idx="1">
-                          <a:schemeClr val="lt1"/>
-                        </a:fillRef>
-                        <a:effectRef idx="0">
-                          <a:schemeClr val="dk1"/>
-                        </a:effectRef>
-                        <a:fontRef idx="minor">
-                          <a:schemeClr val="dk1"/>
-                        </a:fontRef>
-                      </wps:style>
-                      <wps:bodyPr rot="0" spcFirstLastPara="0" vertOverflow="overflow" horzOverflow="overflow" vert="horz" wrap="square" lIns="91440" tIns="45720" rIns="91440" bIns="45720" numCol="1" spcCol="0" rtlCol="0" fromWordArt="0" anchor="ctr" anchorCtr="0" forceAA="0" compatLnSpc="1">
-                        <a:prstTxWarp prst="textNoShape">
-                          <a:avLst/>
-                        </a:prstTxWarp>
-                        <a:noAutofit/>
-                      </wps:bodyPr>
-                    </wps:wsp>
-                  </a:graphicData>
-                </a:graphic>
-                <wp14:sizeRelH relativeFrom="margin">
-                  <wp14:pctWidth>0</wp14:pctWidth>
-                </wp14:sizeRelH>
-                <wp14:sizeRelV relativeFrom="margin">
-                  <wp14:pctHeight>0</wp14:pctHeight>
-                </wp14:sizeRelV>
-              </wp:anchor>
-            </w:drawing>
-          </mc:Choice>
-          <mc:Fallback>
-            <w:pict>
-              <v:rect w14:anchorId="50774AEA" id="Rectangle 6" o:spid="_x0000_s1026" style="position:absolute;margin-left:148.8pt;margin-top:26.25pt;width:27.6pt;height:17.4pt;z-index:251727872;visibility:visible;mso-wrap-style:square;mso-width-percent:0;mso-height-percent:0;mso-wrap-distance-left:9pt;mso-wrap-distance-top:0;mso-wrap-distance-right:9pt;mso-wrap-distance-bottom:0;mso-position-horizontal:absolute;mso-position-horizontal-relative:margin;mso-position-vertical:absolute;mso-position-vertical-relative:text;mso-width-percent:0;mso-height-percent:0;mso-width-relative:margin;mso-height-relative:margin;v-text-anchor:middle" o:gfxdata="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" filled="f" strokecolor="#e00" strokeweight="2pt">
-                <w10:wrap anchorx="margin"/>
-              </v:rect>
-            </w:pict>
-          </mc:Fallback>
-        </mc:AlternateContent>
-      </w:r>
-      <w:r>
-        <w:rPr>
-          <w:noProof/>
-        </w:rPr>
-        <mc:AlternateContent>
-          <mc:Choice Requires="wps">
-            <w:drawing>
-              <wp:anchor distT="0" distB="0" distL="114300" distR="114300" simplePos="0" relativeHeight="251728896" behindDoc="0" locked="0" layoutInCell="1" allowOverlap="1" wp14:anchorId="61556F35" wp14:editId="576635E4">
-                <wp:simplePos x="0" y="0"/>
-                <wp:positionH relativeFrom="column">
-                  <wp:posOffset>2346959</wp:posOffset>
-                </wp:positionH>
-                <wp:positionV relativeFrom="paragraph">
-                  <wp:posOffset>501015</wp:posOffset>
-                </wp:positionV>
-                <wp:extent cx="391795" cy="152400"/>
-                <wp:effectExtent l="76200" t="76200" r="84455" b="95250"/>
-                <wp:wrapNone/>
-                <wp:docPr id="780741816" name="Straight Arrow Connector 7"/>
+                <wp:docPr id="855243594" name="Straight Arrow Connector 7"/>
                 <wp:cNvGraphicFramePr/>
                 <a:graphic xmlns:a="http://schemas.openxmlformats.org/drawingml/2006/main">
                   <a:graphicData uri="http://schemas.microsoft.com/office/word/2010/wordprocessingShape">
                     <wps:wsp>
                       <wps:cNvCnPr/>
                       <wps:spPr>
-                        <a:xfrm flipH="1" flipV="1">
+                        <a:xfrm flipH="1">
                           <a:off x="0" y="0"/>
-                          <a:ext cx="391795" cy="152400"/>
+                          <a:ext cx="1297305" cy="464185"/>
                         </a:xfrm>
                         <a:prstGeom prst="straightConnector1">
                           <a:avLst/>
@@ -4387,7 +4351,11 @@
           </mc:Choice>
           <mc:Fallback>
             <w:pict>
-              <v:shape w14:anchorId="26EF62BB" id="Straight Arrow Connector 7" o:spid="_x0000_s1026" type="#_x0000_t32" style="position:absolute;margin-left:184.8pt;margin-top:39.45pt;width:30.85pt;height:12pt;flip:x y;z-index:251728896;visibility:visible;mso-wrap-style:square;mso-width-percent:0;mso-height-percent:0;mso-wrap-distance-left:9pt;mso-wrap-distance-top:0;mso-wrap-distance-right:9pt;mso-wrap-distance-bottom:0;mso-position-horizontal:absolute;mso-position-horizontal-relative:text;mso-position-vertical:absolute;mso-position-vertical-relative:text;mso-width-percent:0;mso-height-percent:0;mso-width-relative:margin;mso-height-relative:margin" o:gfxdata="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" strokecolor="#e00" strokeweight="2pt">
+              <v:shapetype w14:anchorId="50B0DCD5" id="_x0000_t32" coordsize="21600,21600" o:spt="32" o:oned="t" path="m,l21600,21600e" filled="f">
+                <v:path arrowok="t" fillok="f" o:connecttype="none"/>
+                <o:lock v:ext="edit" shapetype="t"/>
+              </v:shapetype>
+              <v:shape id="Straight Arrow Connector 7" o:spid="_x0000_s1026" type="#_x0000_t32" style="position:absolute;margin-left:175.45pt;margin-top:113.1pt;width:102.15pt;height:36.55pt;flip:x;z-index:251793408;visibility:visible;mso-wrap-style:square;mso-width-percent:0;mso-height-percent:0;mso-wrap-distance-left:9pt;mso-wrap-distance-top:0;mso-wrap-distance-right:9pt;mso-wrap-distance-bottom:0;mso-position-horizontal:absolute;mso-position-horizontal-relative:text;mso-position-vertical:absolute;mso-position-vertical-relative:text;mso-width-percent:0;mso-height-percent:0;mso-width-relative:margin;mso-height-relative:margin" o:gfxdata="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" strokecolor="#e00" strokeweight="2pt">
                 <v:stroke endarrow="block" joinstyle="miter"/>
               </v:shape>
             </w:pict>
@@ -4401,27 +4369,107 @@
         <mc:AlternateContent>
           <mc:Choice Requires="wps">
             <w:drawing>
-              <wp:anchor distT="0" distB="0" distL="114300" distR="114300" simplePos="0" relativeHeight="251725824" behindDoc="0" locked="0" layoutInCell="1" allowOverlap="1" wp14:anchorId="05F4372F" wp14:editId="7F7CF6E3">
+              <wp:anchor distT="0" distB="0" distL="114300" distR="114300" simplePos="0" relativeHeight="251792384" behindDoc="0" locked="0" layoutInCell="1" allowOverlap="1" wp14:anchorId="63D3BE5E" wp14:editId="3B81222E">
+                <wp:simplePos x="0" y="0"/>
+                <wp:positionH relativeFrom="margin">
+                  <wp:posOffset>1196340</wp:posOffset>
+                </wp:positionH>
+                <wp:positionV relativeFrom="paragraph">
+                  <wp:posOffset>1771650</wp:posOffset>
+                </wp:positionV>
+                <wp:extent cx="960120" cy="304800"/>
+                <wp:effectExtent l="0" t="0" r="11430" b="19050"/>
+                <wp:wrapNone/>
+                <wp:docPr id="1630694183" name="Rectangle 6"/>
+                <wp:cNvGraphicFramePr/>
+                <a:graphic xmlns:a="http://schemas.openxmlformats.org/drawingml/2006/main">
+                  <a:graphicData uri="http://schemas.microsoft.com/office/word/2010/wordprocessingShape">
+                    <wps:wsp>
+                      <wps:cNvSpPr/>
+                      <wps:spPr>
+                        <a:xfrm>
+                          <a:off x="0" y="0"/>
+                          <a:ext cx="960120" cy="304800"/>
+                        </a:xfrm>
+                        <a:prstGeom prst="rect">
+                          <a:avLst/>
+                        </a:prstGeom>
+                        <a:noFill/>
+                        <a:ln w="25400">
+                          <a:solidFill>
+                            <a:srgbClr val="EE0000"/>
+                          </a:solidFill>
+                        </a:ln>
+                      </wps:spPr>
+                      <wps:style>
+                        <a:lnRef idx="2">
+                          <a:schemeClr val="dk1"/>
+                        </a:lnRef>
+                        <a:fillRef idx="1">
+                          <a:schemeClr val="lt1"/>
+                        </a:fillRef>
+                        <a:effectRef idx="0">
+                          <a:schemeClr val="dk1"/>
+                        </a:effectRef>
+                        <a:fontRef idx="minor">
+                          <a:schemeClr val="dk1"/>
+                        </a:fontRef>
+                      </wps:style>
+                      <wps:bodyPr rot="0" spcFirstLastPara="0" vertOverflow="overflow" horzOverflow="overflow" vert="horz" wrap="square" lIns="91440" tIns="45720" rIns="91440" bIns="45720" numCol="1" spcCol="0" rtlCol="0" fromWordArt="0" anchor="ctr" anchorCtr="0" forceAA="0" compatLnSpc="1">
+                        <a:prstTxWarp prst="textNoShape">
+                          <a:avLst/>
+                        </a:prstTxWarp>
+                        <a:noAutofit/>
+                      </wps:bodyPr>
+                    </wps:wsp>
+                  </a:graphicData>
+                </a:graphic>
+                <wp14:sizeRelH relativeFrom="margin">
+                  <wp14:pctWidth>0</wp14:pctWidth>
+                </wp14:sizeRelH>
+                <wp14:sizeRelV relativeFrom="margin">
+                  <wp14:pctHeight>0</wp14:pctHeight>
+                </wp14:sizeRelV>
+              </wp:anchor>
+            </w:drawing>
+          </mc:Choice>
+          <mc:Fallback>
+            <w:pict>
+              <v:rect w14:anchorId="3F5F97C2" id="Rectangle 6" o:spid="_x0000_s1026" style="position:absolute;margin-left:94.2pt;margin-top:139.5pt;width:75.6pt;height:24pt;z-index:251792384;visibility:visible;mso-wrap-style:square;mso-width-percent:0;mso-height-percent:0;mso-wrap-distance-left:9pt;mso-wrap-distance-top:0;mso-wrap-distance-right:9pt;mso-wrap-distance-bottom:0;mso-position-horizontal:absolute;mso-position-horizontal-relative:margin;mso-position-vertical:absolute;mso-position-vertical-relative:text;mso-width-percent:0;mso-height-percent:0;mso-width-relative:margin;mso-height-relative:margin;v-text-anchor:middle" o:gfxdata="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" filled="f" strokecolor="#e00" strokeweight="2pt">
+                <w10:wrap anchorx="margin"/>
+              </v:rect>
+            </w:pict>
+          </mc:Fallback>
+        </mc:AlternateContent>
+      </w:r>
+      <w:r>
+        <w:rPr>
+          <w:noProof/>
+        </w:rPr>
+        <mc:AlternateContent>
+          <mc:Choice Requires="wps">
+            <w:drawing>
+              <wp:anchor distT="0" distB="0" distL="114300" distR="114300" simplePos="0" relativeHeight="251791360" behindDoc="0" locked="0" layoutInCell="1" allowOverlap="1" wp14:anchorId="196C71BD" wp14:editId="3F66F3BF">
                 <wp:simplePos x="0" y="0"/>
                 <wp:positionH relativeFrom="column">
-                  <wp:posOffset>2083435</wp:posOffset>
+                  <wp:posOffset>1223010</wp:posOffset>
                 </wp:positionH>
                 <wp:positionV relativeFrom="paragraph">
-                  <wp:posOffset>1125855</wp:posOffset>
+                  <wp:posOffset>3432175</wp:posOffset>
                 </wp:positionV>
-                <wp:extent cx="1297723" cy="464185"/>
-                <wp:effectExtent l="57150" t="76200" r="93345" b="88265"/>
+                <wp:extent cx="1032510" cy="412115"/>
+                <wp:effectExtent l="76200" t="76200" r="91440" b="83185"/>
                 <wp:wrapNone/>
-                <wp:docPr id="1113785963" name="Straight Arrow Connector 7"/>
+                <wp:docPr id="2101768866" name="Straight Arrow Connector 7"/>
                 <wp:cNvGraphicFramePr/>
                 <a:graphic xmlns:a="http://schemas.openxmlformats.org/drawingml/2006/main">
                   <a:graphicData uri="http://schemas.microsoft.com/office/word/2010/wordprocessingShape">
                     <wps:wsp>
                       <wps:cNvCnPr/>
                       <wps:spPr>
-                        <a:xfrm flipH="1">
+                        <a:xfrm flipH="1" flipV="1">
                           <a:off x="0" y="0"/>
-                          <a:ext cx="1297723" cy="464185"/>
+                          <a:ext cx="1032510" cy="412115"/>
                         </a:xfrm>
                         <a:prstGeom prst="straightConnector1">
                           <a:avLst/>
@@ -4470,7 +4518,7 @@
           </mc:Choice>
           <mc:Fallback>
             <w:pict>
-              <v:shape w14:anchorId="438A0FC0" id="Straight Arrow Connector 7" o:spid="_x0000_s1026" type="#_x0000_t32" style="position:absolute;margin-left:164.05pt;margin-top:88.65pt;width:102.2pt;height:36.55pt;flip:x;z-index:251725824;visibility:visible;mso-wrap-style:square;mso-width-percent:0;mso-height-percent:0;mso-wrap-distance-left:9pt;mso-wrap-distance-top:0;mso-wrap-distance-right:9pt;mso-wrap-distance-bottom:0;mso-position-horizontal:absolute;mso-position-horizontal-relative:text;mso-position-vertical:absolute;mso-position-vertical-relative:text;mso-width-percent:0;mso-height-percent:0;mso-width-relative:margin;mso-height-relative:margin" o:gfxdata="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" strokecolor="#e00" strokeweight="2pt">
+              <v:shape w14:anchorId="6BC08858" id="Straight Arrow Connector 7" o:spid="_x0000_s1026" type="#_x0000_t32" style="position:absolute;margin-left:96.3pt;margin-top:270.25pt;width:81.3pt;height:32.45pt;flip:x y;z-index:251791360;visibility:visible;mso-wrap-style:square;mso-width-percent:0;mso-height-percent:0;mso-wrap-distance-left:9pt;mso-wrap-distance-top:0;mso-wrap-distance-right:9pt;mso-wrap-distance-bottom:0;mso-position-horizontal:absolute;mso-position-horizontal-relative:text;mso-position-vertical:absolute;mso-position-vertical-relative:text;mso-width-percent:0;mso-height-percent:0;mso-width-relative:margin;mso-height-relative:margin" o:gfxdata="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" strokecolor="#e00" strokeweight="2pt">
                 <v:stroke endarrow="block" joinstyle="miter"/>
               </v:shape>
             </w:pict>
@@ -4484,18 +4532,18 @@
         <mc:AlternateContent>
           <mc:Choice Requires="wps">
             <w:drawing>
-              <wp:anchor distT="0" distB="0" distL="114300" distR="114300" simplePos="0" relativeHeight="251724800" behindDoc="0" locked="0" layoutInCell="1" allowOverlap="1" wp14:anchorId="73B8A8A2" wp14:editId="78186C7B">
+              <wp:anchor distT="0" distB="0" distL="114300" distR="114300" simplePos="0" relativeHeight="251790336" behindDoc="0" locked="0" layoutInCell="1" allowOverlap="1" wp14:anchorId="5B64CBA1" wp14:editId="6C83150B">
                 <wp:simplePos x="0" y="0"/>
                 <wp:positionH relativeFrom="margin">
-                  <wp:posOffset>1181100</wp:posOffset>
+                  <wp:posOffset>121920</wp:posOffset>
                 </wp:positionH>
                 <wp:positionV relativeFrom="paragraph">
-                  <wp:posOffset>1453515</wp:posOffset>
+                  <wp:posOffset>3295650</wp:posOffset>
                 </wp:positionV>
-                <wp:extent cx="868680" cy="251460"/>
-                <wp:effectExtent l="0" t="0" r="26670" b="15240"/>
+                <wp:extent cx="1074420" cy="205740"/>
+                <wp:effectExtent l="0" t="0" r="11430" b="22860"/>
                 <wp:wrapNone/>
-                <wp:docPr id="1330114600" name="Rectangle 6"/>
+                <wp:docPr id="1981473196" name="Rectangle 6"/>
                 <wp:cNvGraphicFramePr/>
                 <a:graphic xmlns:a="http://schemas.openxmlformats.org/drawingml/2006/main">
                   <a:graphicData uri="http://schemas.microsoft.com/office/word/2010/wordprocessingShape">
@@ -4504,7 +4552,7 @@
                       <wps:spPr>
                         <a:xfrm>
                           <a:off x="0" y="0"/>
-                          <a:ext cx="868680" cy="251460"/>
+                          <a:ext cx="1074420" cy="205740"/>
                         </a:xfrm>
                         <a:prstGeom prst="rect">
                           <a:avLst/>
@@ -4550,7 +4598,7 @@
           </mc:Choice>
           <mc:Fallback>
             <w:pict>
-              <v:rect w14:anchorId="360AB712" id="Rectangle 6" o:spid="_x0000_s1026" style="position:absolute;margin-left:93pt;margin-top:114.45pt;width:68.4pt;height:19.8pt;z-index:251724800;visibility:visible;mso-wrap-style:square;mso-width-percent:0;mso-height-percent:0;mso-wrap-distance-left:9pt;mso-wrap-distance-top:0;mso-wrap-distance-right:9pt;mso-wrap-distance-bottom:0;mso-position-horizontal:absolute;mso-position-horizontal-relative:margin;mso-position-vertical:absolute;mso-position-vertical-relative:text;mso-width-percent:0;mso-height-percent:0;mso-width-relative:margin;mso-height-relative:margin;v-text-anchor:middle" o:gfxdata="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" filled="f" strokecolor="#e00" strokeweight="2pt">
+              <v:rect w14:anchorId="281480E9" id="Rectangle 6" o:spid="_x0000_s1026" style="position:absolute;margin-left:9.6pt;margin-top:259.5pt;width:84.6pt;height:16.2pt;z-index:251790336;visibility:visible;mso-wrap-style:square;mso-width-percent:0;mso-height-percent:0;mso-wrap-distance-left:9pt;mso-wrap-distance-top:0;mso-wrap-distance-right:9pt;mso-wrap-distance-bottom:0;mso-position-horizontal:absolute;mso-position-horizontal-relative:margin;mso-position-vertical:absolute;mso-position-vertical-relative:text;mso-width-percent:0;mso-height-percent:0;mso-width-relative:margin;mso-height-relative:margin;v-text-anchor:middle" o:gfxdata="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" filled="f" strokecolor="#e00" strokeweight="2pt">
                 <w10:wrap anchorx="margin"/>
               </v:rect>
             </w:pict>
@@ -4564,27 +4612,107 @@
         <mc:AlternateContent>
           <mc:Choice Requires="wps">
             <w:drawing>
-              <wp:anchor distT="0" distB="0" distL="114300" distR="114300" simplePos="0" relativeHeight="251722752" behindDoc="0" locked="0" layoutInCell="1" allowOverlap="1" wp14:anchorId="73FD50CF" wp14:editId="5C069B00">
+              <wp:anchor distT="0" distB="0" distL="114300" distR="114300" simplePos="0" relativeHeight="251794432" behindDoc="0" locked="0" layoutInCell="1" allowOverlap="1" wp14:anchorId="38774389" wp14:editId="03357179">
+                <wp:simplePos x="0" y="0"/>
+                <wp:positionH relativeFrom="margin">
+                  <wp:posOffset>2545080</wp:posOffset>
+                </wp:positionH>
+                <wp:positionV relativeFrom="paragraph">
+                  <wp:posOffset>377190</wp:posOffset>
+                </wp:positionV>
+                <wp:extent cx="350520" cy="220980"/>
+                <wp:effectExtent l="0" t="0" r="11430" b="26670"/>
+                <wp:wrapNone/>
+                <wp:docPr id="1321157381" name="Rectangle 6"/>
+                <wp:cNvGraphicFramePr/>
+                <a:graphic xmlns:a="http://schemas.openxmlformats.org/drawingml/2006/main">
+                  <a:graphicData uri="http://schemas.microsoft.com/office/word/2010/wordprocessingShape">
+                    <wps:wsp>
+                      <wps:cNvSpPr/>
+                      <wps:spPr>
+                        <a:xfrm>
+                          <a:off x="0" y="0"/>
+                          <a:ext cx="350520" cy="220980"/>
+                        </a:xfrm>
+                        <a:prstGeom prst="rect">
+                          <a:avLst/>
+                        </a:prstGeom>
+                        <a:noFill/>
+                        <a:ln w="25400">
+                          <a:solidFill>
+                            <a:srgbClr val="EE0000"/>
+                          </a:solidFill>
+                        </a:ln>
+                      </wps:spPr>
+                      <wps:style>
+                        <a:lnRef idx="2">
+                          <a:schemeClr val="dk1"/>
+                        </a:lnRef>
+                        <a:fillRef idx="1">
+                          <a:schemeClr val="lt1"/>
+                        </a:fillRef>
+                        <a:effectRef idx="0">
+                          <a:schemeClr val="dk1"/>
+                        </a:effectRef>
+                        <a:fontRef idx="minor">
+                          <a:schemeClr val="dk1"/>
+                        </a:fontRef>
+                      </wps:style>
+                      <wps:bodyPr rot="0" spcFirstLastPara="0" vertOverflow="overflow" horzOverflow="overflow" vert="horz" wrap="square" lIns="91440" tIns="45720" rIns="91440" bIns="45720" numCol="1" spcCol="0" rtlCol="0" fromWordArt="0" anchor="ctr" anchorCtr="0" forceAA="0" compatLnSpc="1">
+                        <a:prstTxWarp prst="textNoShape">
+                          <a:avLst/>
+                        </a:prstTxWarp>
+                        <a:noAutofit/>
+                      </wps:bodyPr>
+                    </wps:wsp>
+                  </a:graphicData>
+                </a:graphic>
+                <wp14:sizeRelH relativeFrom="margin">
+                  <wp14:pctWidth>0</wp14:pctWidth>
+                </wp14:sizeRelH>
+                <wp14:sizeRelV relativeFrom="margin">
+                  <wp14:pctHeight>0</wp14:pctHeight>
+                </wp14:sizeRelV>
+              </wp:anchor>
+            </w:drawing>
+          </mc:Choice>
+          <mc:Fallback>
+            <w:pict>
+              <v:rect w14:anchorId="515B9AFA" id="Rectangle 6" o:spid="_x0000_s1026" style="position:absolute;margin-left:200.4pt;margin-top:29.7pt;width:27.6pt;height:17.4pt;z-index:251794432;visibility:visible;mso-wrap-style:square;mso-width-percent:0;mso-height-percent:0;mso-wrap-distance-left:9pt;mso-wrap-distance-top:0;mso-wrap-distance-right:9pt;mso-wrap-distance-bottom:0;mso-position-horizontal:absolute;mso-position-horizontal-relative:margin;mso-position-vertical:absolute;mso-position-vertical-relative:text;mso-width-percent:0;mso-height-percent:0;mso-width-relative:margin;mso-height-relative:margin;v-text-anchor:middle" o:gfxdata="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" filled="f" strokecolor="#e00" strokeweight="2pt">
+                <w10:wrap anchorx="margin"/>
+              </v:rect>
+            </w:pict>
+          </mc:Fallback>
+        </mc:AlternateContent>
+      </w:r>
+      <w:r>
+        <w:rPr>
+          <w:noProof/>
+        </w:rPr>
+        <mc:AlternateContent>
+          <mc:Choice Requires="wps">
+            <w:drawing>
+              <wp:anchor distT="0" distB="0" distL="114300" distR="114300" simplePos="0" relativeHeight="251795456" behindDoc="0" locked="0" layoutInCell="1" allowOverlap="1" wp14:anchorId="483587C9" wp14:editId="4793912E">
                 <wp:simplePos x="0" y="0"/>
                 <wp:positionH relativeFrom="column">
-                  <wp:posOffset>845820</wp:posOffset>
+                  <wp:posOffset>3001645</wp:posOffset>
                 </wp:positionH>
                 <wp:positionV relativeFrom="paragraph">
-                  <wp:posOffset>2322195</wp:posOffset>
+                  <wp:posOffset>544830</wp:posOffset>
                 </wp:positionV>
-                <wp:extent cx="933450" cy="464185"/>
-                <wp:effectExtent l="57150" t="76200" r="95250" b="88265"/>
+                <wp:extent cx="391795" cy="152400"/>
+                <wp:effectExtent l="76200" t="76200" r="84455" b="95250"/>
                 <wp:wrapNone/>
-                <wp:docPr id="778824918" name="Straight Arrow Connector 7"/>
+                <wp:docPr id="1383178577" name="Straight Arrow Connector 7"/>
                 <wp:cNvGraphicFramePr/>
                 <a:graphic xmlns:a="http://schemas.openxmlformats.org/drawingml/2006/main">
                   <a:graphicData uri="http://schemas.microsoft.com/office/word/2010/wordprocessingShape">
                     <wps:wsp>
                       <wps:cNvCnPr/>
                       <wps:spPr>
-                        <a:xfrm flipH="1">
+                        <a:xfrm flipH="1" flipV="1">
                           <a:off x="0" y="0"/>
-                          <a:ext cx="933450" cy="464185"/>
+                          <a:ext cx="391795" cy="152400"/>
                         </a:xfrm>
                         <a:prstGeom prst="straightConnector1">
                           <a:avLst/>
@@ -4633,7 +4761,7 @@
           </mc:Choice>
           <mc:Fallback>
             <w:pict>
-              <v:shape w14:anchorId="6F878535" id="Straight Arrow Connector 7" o:spid="_x0000_s1026" type="#_x0000_t32" style="position:absolute;margin-left:66.6pt;margin-top:182.85pt;width:73.5pt;height:36.55pt;flip:x;z-index:251722752;visibility:visible;mso-wrap-style:square;mso-width-percent:0;mso-height-percent:0;mso-wrap-distance-left:9pt;mso-wrap-distance-top:0;mso-wrap-distance-right:9pt;mso-wrap-distance-bottom:0;mso-position-horizontal:absolute;mso-position-horizontal-relative:text;mso-position-vertical:absolute;mso-position-vertical-relative:text;mso-width-percent:0;mso-height-percent:0;mso-width-relative:margin;mso-height-relative:margin" o:gfxdata="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" strokecolor="#e00" strokeweight="2pt">
+              <v:shape w14:anchorId="185A719C" id="Straight Arrow Connector 7" o:spid="_x0000_s1026" type="#_x0000_t32" style="position:absolute;margin-left:236.35pt;margin-top:42.9pt;width:30.85pt;height:12pt;flip:x y;z-index:251795456;visibility:visible;mso-wrap-style:square;mso-width-percent:0;mso-height-percent:0;mso-wrap-distance-left:9pt;mso-wrap-distance-top:0;mso-wrap-distance-right:9pt;mso-wrap-distance-bottom:0;mso-position-horizontal:absolute;mso-position-horizontal-relative:text;mso-position-vertical:absolute;mso-position-vertical-relative:text;mso-width-percent:0;mso-height-percent:0;mso-width-relative:margin;mso-height-relative:margin" o:gfxdata="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" strokecolor="#e00" strokeweight="2pt">
                 <v:stroke endarrow="block" joinstyle="miter"/>
               </v:shape>
             </w:pict>
@@ -4641,94 +4769,11 @@
         </mc:AlternateContent>
       </w:r>
       <w:r>
-        <w:rPr>
-          <w:noProof/>
-        </w:rPr>
-        <mc:AlternateContent>
-          <mc:Choice Requires="wps">
-            <w:drawing>
-              <wp:anchor distT="0" distB="0" distL="114300" distR="114300" simplePos="0" relativeHeight="251721728" behindDoc="0" locked="0" layoutInCell="1" allowOverlap="1" wp14:anchorId="2D7EDCE3" wp14:editId="047533A2">
-                <wp:simplePos x="0" y="0"/>
-                <wp:positionH relativeFrom="margin">
-                  <wp:posOffset>152400</wp:posOffset>
-                </wp:positionH>
-                <wp:positionV relativeFrom="paragraph">
-                  <wp:posOffset>2657475</wp:posOffset>
-                </wp:positionV>
-                <wp:extent cx="624840" cy="251460"/>
-                <wp:effectExtent l="0" t="0" r="22860" b="15240"/>
-                <wp:wrapNone/>
-                <wp:docPr id="1959128657" name="Rectangle 6"/>
-                <wp:cNvGraphicFramePr/>
-                <a:graphic xmlns:a="http://schemas.openxmlformats.org/drawingml/2006/main">
-                  <a:graphicData uri="http://schemas.microsoft.com/office/word/2010/wordprocessingShape">
-                    <wps:wsp>
-                      <wps:cNvSpPr/>
-                      <wps:spPr>
-                        <a:xfrm>
-                          <a:off x="0" y="0"/>
-                          <a:ext cx="624840" cy="251460"/>
-                        </a:xfrm>
-                        <a:prstGeom prst="rect">
-                          <a:avLst/>
-                        </a:prstGeom>
-                        <a:noFill/>
-                        <a:ln w="25400">
-                          <a:solidFill>
-                            <a:srgbClr val="EE0000"/>
-                          </a:solidFill>
-                        </a:ln>
-                      </wps:spPr>
-                      <wps:style>
-                        <a:lnRef idx="2">
-                          <a:schemeClr val="dk1"/>
-                        </a:lnRef>
-                        <a:fillRef idx="1">
-                          <a:schemeClr val="lt1"/>
-                        </a:fillRef>
-                        <a:effectRef idx="0">
-                          <a:schemeClr val="dk1"/>
-                        </a:effectRef>
-                        <a:fontRef idx="minor">
-                          <a:schemeClr val="dk1"/>
-                        </a:fontRef>
-                      </wps:style>
-                      <wps:bodyPr rot="0" spcFirstLastPara="0" vertOverflow="overflow" horzOverflow="overflow" vert="horz" wrap="square" lIns="91440" tIns="45720" rIns="91440" bIns="45720" numCol="1" spcCol="0" rtlCol="0" fromWordArt="0" anchor="ctr" anchorCtr="0" forceAA="0" compatLnSpc="1">
-                        <a:prstTxWarp prst="textNoShape">
-                          <a:avLst/>
-                        </a:prstTxWarp>
-                        <a:noAutofit/>
-                      </wps:bodyPr>
-                    </wps:wsp>
-                  </a:graphicData>
-                </a:graphic>
-                <wp14:sizeRelH relativeFrom="margin">
-                  <wp14:pctWidth>0</wp14:pctWidth>
-                </wp14:sizeRelH>
-                <wp14:sizeRelV relativeFrom="margin">
-                  <wp14:pctHeight>0</wp14:pctHeight>
-                </wp14:sizeRelV>
-              </wp:anchor>
-            </w:drawing>
-          </mc:Choice>
-          <mc:Fallback>
-            <w:pict>
-              <v:rect w14:anchorId="2876191C" id="Rectangle 6" o:spid="_x0000_s1026" style="position:absolute;margin-left:12pt;margin-top:209.25pt;width:49.2pt;height:19.8pt;z-index:251721728;visibility:visible;mso-wrap-style:square;mso-width-percent:0;mso-height-percent:0;mso-wrap-distance-left:9pt;mso-wrap-distance-top:0;mso-wrap-distance-right:9pt;mso-wrap-distance-bottom:0;mso-position-horizontal:absolute;mso-position-horizontal-relative:margin;mso-position-vertical:absolute;mso-position-vertical-relative:text;mso-width-percent:0;mso-height-percent:0;mso-width-relative:margin;mso-height-relative:margin;v-text-anchor:middle" o:gfxdata="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" filled="f" strokecolor="#e00" strokeweight="2pt">
-                <w10:wrap anchorx="margin"/>
-              </v:rect>
-            </w:pict>
-          </mc:Fallback>
-        </mc:AlternateContent>
-      </w:r>
-      <w:r>
-        <w:rPr>
-          <w:noProof/>
-        </w:rPr>
         <w:drawing>
-          <wp:inline distT="0" distB="0" distL="0" distR="0" wp14:anchorId="76D1CA46" wp14:editId="06CE0584">
-            <wp:extent cx="6645910" cy="3781425"/>
-            <wp:effectExtent l="0" t="0" r="2540" b="9525"/>
-            <wp:docPr id="379696664" name="Picture 1"/>
+          <wp:inline distT="0" distB="0" distL="0" distR="0" wp14:anchorId="0481DD37" wp14:editId="051D7FEF">
+            <wp:extent cx="6645910" cy="4017010"/>
+            <wp:effectExtent l="0" t="0" r="2540" b="2540"/>
+            <wp:docPr id="717472362" name="Picture 1"/>
             <wp:cNvGraphicFramePr>
               <a:graphicFrameLocks xmlns:a="http://schemas.openxmlformats.org/drawingml/2006/main" noChangeAspect="1"/>
             </wp:cNvGraphicFramePr>
@@ -4736,7 +4781,7 @@
               <a:graphicData uri="http://schemas.openxmlformats.org/drawingml/2006/picture">
                 <pic:pic xmlns:pic="http://schemas.openxmlformats.org/drawingml/2006/picture">
                   <pic:nvPicPr>
-                    <pic:cNvPr id="379696664" name=""/>
+                    <pic:cNvPr id="717472362" name=""/>
                     <pic:cNvPicPr/>
                   </pic:nvPicPr>
                   <pic:blipFill>
@@ -4748,7 +4793,7 @@
                   <pic:spPr>
                     <a:xfrm>
                       <a:off x="0" y="0"/>
-                      <a:ext cx="6645910" cy="3781425"/>
+                      <a:ext cx="6645910" cy="4017010"/>
                     </a:xfrm>
                     <a:prstGeom prst="rect">
                       <a:avLst/>
@@ -4763,13 +4808,13 @@
     </w:p>
     <w:p/>
     <w:p/>
+    <w:p/>
     <w:p>
       <w:pPr>
         <w:pStyle w:val="Heading2"/>
       </w:pPr>
       <w:bookmarkStart w:id="5" w:name="_Toc225774504"/>
       <w:r>
-        <w:lastRenderedPageBreak/>
         <w:t>Patients-List (All Patients Demographic data)</w:t>
       </w:r>
       <w:bookmarkEnd w:id="5"/>
@@ -4783,8 +4828,13 @@
         </w:numPr>
       </w:pPr>
       <w:r>
-        <w:t>Navigate to Manage Patients &gt; Patient Center</w:t>
-      </w:r>
+        <w:t xml:space="preserve">Navigate to Manage Patients &gt; Patient </w:t>
+      </w:r>
+      <w:proofErr w:type="spellStart"/>
+      <w:r>
+        <w:t>Center</w:t>
+      </w:r>
+      <w:proofErr w:type="spellEnd"/>
     </w:p>
     <w:p>
       <w:r>
@@ -4954,168 +5004,8 @@
         <w:rPr>
           <w:noProof/>
         </w:rPr>
-        <mc:AlternateContent>
-          <mc:Choice Requires="wps">
-            <w:drawing>
-              <wp:anchor distT="0" distB="0" distL="114300" distR="114300" simplePos="0" relativeHeight="251730944" behindDoc="0" locked="0" layoutInCell="1" allowOverlap="1" wp14:anchorId="153C2268" wp14:editId="6007FE2C">
-                <wp:simplePos x="0" y="0"/>
-                <wp:positionH relativeFrom="margin">
-                  <wp:posOffset>-45720</wp:posOffset>
-                </wp:positionH>
-                <wp:positionV relativeFrom="paragraph">
-                  <wp:posOffset>-1417320</wp:posOffset>
-                </wp:positionV>
-                <wp:extent cx="624840" cy="251460"/>
-                <wp:effectExtent l="0" t="0" r="22860" b="15240"/>
-                <wp:wrapNone/>
-                <wp:docPr id="606200981" name="Rectangle 6"/>
-                <wp:cNvGraphicFramePr/>
-                <a:graphic xmlns:a="http://schemas.openxmlformats.org/drawingml/2006/main">
-                  <a:graphicData uri="http://schemas.microsoft.com/office/word/2010/wordprocessingShape">
-                    <wps:wsp>
-                      <wps:cNvSpPr/>
-                      <wps:spPr>
-                        <a:xfrm>
-                          <a:off x="0" y="0"/>
-                          <a:ext cx="624840" cy="251460"/>
-                        </a:xfrm>
-                        <a:prstGeom prst="rect">
-                          <a:avLst/>
-                        </a:prstGeom>
-                        <a:noFill/>
-                        <a:ln w="25400">
-                          <a:solidFill>
-                            <a:srgbClr val="EE0000"/>
-                          </a:solidFill>
-                        </a:ln>
-                      </wps:spPr>
-                      <wps:style>
-                        <a:lnRef idx="2">
-                          <a:schemeClr val="dk1"/>
-                        </a:lnRef>
-                        <a:fillRef idx="1">
-                          <a:schemeClr val="lt1"/>
-                        </a:fillRef>
-                        <a:effectRef idx="0">
-                          <a:schemeClr val="dk1"/>
-                        </a:effectRef>
-                        <a:fontRef idx="minor">
-                          <a:schemeClr val="dk1"/>
-                        </a:fontRef>
-                      </wps:style>
-                      <wps:bodyPr rot="0" spcFirstLastPara="0" vertOverflow="overflow" horzOverflow="overflow" vert="horz" wrap="square" lIns="91440" tIns="45720" rIns="91440" bIns="45720" numCol="1" spcCol="0" rtlCol="0" fromWordArt="0" anchor="ctr" anchorCtr="0" forceAA="0" compatLnSpc="1">
-                        <a:prstTxWarp prst="textNoShape">
-                          <a:avLst/>
-                        </a:prstTxWarp>
-                        <a:noAutofit/>
-                      </wps:bodyPr>
-                    </wps:wsp>
-                  </a:graphicData>
-                </a:graphic>
-                <wp14:sizeRelH relativeFrom="margin">
-                  <wp14:pctWidth>0</wp14:pctWidth>
-                </wp14:sizeRelH>
-                <wp14:sizeRelV relativeFrom="margin">
-                  <wp14:pctHeight>0</wp14:pctHeight>
-                </wp14:sizeRelV>
-              </wp:anchor>
-            </w:drawing>
-          </mc:Choice>
-          <mc:Fallback>
-            <w:pict>
-              <v:rect w14:anchorId="6712D31F" id="Rectangle 6" o:spid="_x0000_s1026" style="position:absolute;margin-left:-3.6pt;margin-top:-111.6pt;width:49.2pt;height:19.8pt;z-index:251730944;visibility:visible;mso-wrap-style:square;mso-width-percent:0;mso-height-percent:0;mso-wrap-distance-left:9pt;mso-wrap-distance-top:0;mso-wrap-distance-right:9pt;mso-wrap-distance-bottom:0;mso-position-horizontal:absolute;mso-position-horizontal-relative:margin;mso-position-vertical:absolute;mso-position-vertical-relative:text;mso-width-percent:0;mso-height-percent:0;mso-width-relative:margin;mso-height-relative:margin;v-text-anchor:middle" o:gfxdata="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" filled="f" strokecolor="#e00" strokeweight="2pt">
-                <w10:wrap anchorx="margin"/>
-              </v:rect>
-            </w:pict>
-          </mc:Fallback>
-        </mc:AlternateContent>
-      </w:r>
-      <w:r>
-        <w:rPr>
-          <w:noProof/>
-        </w:rPr>
-        <mc:AlternateContent>
-          <mc:Choice Requires="wps">
-            <w:drawing>
-              <wp:anchor distT="0" distB="0" distL="114300" distR="114300" simplePos="0" relativeHeight="251731968" behindDoc="0" locked="0" layoutInCell="1" allowOverlap="1" wp14:anchorId="1A58208D" wp14:editId="2DAEB8CD">
-                <wp:simplePos x="0" y="0"/>
-                <wp:positionH relativeFrom="column">
-                  <wp:posOffset>651510</wp:posOffset>
-                </wp:positionH>
-                <wp:positionV relativeFrom="paragraph">
-                  <wp:posOffset>-1752600</wp:posOffset>
-                </wp:positionV>
-                <wp:extent cx="933450" cy="464185"/>
-                <wp:effectExtent l="57150" t="76200" r="95250" b="88265"/>
-                <wp:wrapNone/>
-                <wp:docPr id="1429117328" name="Straight Arrow Connector 7"/>
-                <wp:cNvGraphicFramePr/>
-                <a:graphic xmlns:a="http://schemas.openxmlformats.org/drawingml/2006/main">
-                  <a:graphicData uri="http://schemas.microsoft.com/office/word/2010/wordprocessingShape">
-                    <wps:wsp>
-                      <wps:cNvCnPr/>
-                      <wps:spPr>
-                        <a:xfrm flipH="1">
-                          <a:off x="0" y="0"/>
-                          <a:ext cx="933450" cy="464185"/>
-                        </a:xfrm>
-                        <a:prstGeom prst="straightConnector1">
-                          <a:avLst/>
-                        </a:prstGeom>
-                        <a:ln w="25400">
-                          <a:solidFill>
-                            <a:srgbClr val="EE0000"/>
-                          </a:solidFill>
-                          <a:tailEnd type="triangle"/>
-                        </a:ln>
-                        <a:effectLst>
-                          <a:glow rad="63500">
-                            <a:schemeClr val="accent3">
-                              <a:satMod val="175000"/>
-                              <a:alpha val="40000"/>
-                            </a:schemeClr>
-                          </a:glow>
-                        </a:effectLst>
-                      </wps:spPr>
-                      <wps:style>
-                        <a:lnRef idx="1">
-                          <a:schemeClr val="accent1"/>
-                        </a:lnRef>
-                        <a:fillRef idx="0">
-                          <a:schemeClr val="accent1"/>
-                        </a:fillRef>
-                        <a:effectRef idx="0">
-                          <a:schemeClr val="accent1"/>
-                        </a:effectRef>
-                        <a:fontRef idx="minor">
-                          <a:schemeClr val="tx1"/>
-                        </a:fontRef>
-                      </wps:style>
-                      <wps:bodyPr/>
-                    </wps:wsp>
-                  </a:graphicData>
-                </a:graphic>
-                <wp14:sizeRelH relativeFrom="margin">
-                  <wp14:pctWidth>0</wp14:pctWidth>
-                </wp14:sizeRelH>
-                <wp14:sizeRelV relativeFrom="margin">
-                  <wp14:pctHeight>0</wp14:pctHeight>
-                </wp14:sizeRelV>
-              </wp:anchor>
-            </w:drawing>
-          </mc:Choice>
-          <mc:Fallback>
-            <w:pict>
-              <v:shape w14:anchorId="22D01B86" id="Straight Arrow Connector 7" o:spid="_x0000_s1026" type="#_x0000_t32" style="position:absolute;margin-left:51.3pt;margin-top:-138pt;width:73.5pt;height:36.55pt;flip:x;z-index:251731968;visibility:visible;mso-wrap-style:square;mso-width-percent:0;mso-height-percent:0;mso-wrap-distance-left:9pt;mso-wrap-distance-top:0;mso-wrap-distance-right:9pt;mso-wrap-distance-bottom:0;mso-position-horizontal:absolute;mso-position-horizontal-relative:text;mso-position-vertical:absolute;mso-position-vertical-relative:text;mso-width-percent:0;mso-height-percent:0;mso-width-relative:margin;mso-height-relative:margin" o:gfxdata="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" strokecolor="#e00" strokeweight="2pt">
-                <v:stroke endarrow="block" joinstyle="miter"/>
-              </v:shape>
-            </w:pict>
-          </mc:Fallback>
-        </mc:AlternateContent>
-      </w:r>
-      <w:r>
         <w:drawing>
-          <wp:inline distT="0" distB="0" distL="0" distR="0" wp14:anchorId="461EA8E7" wp14:editId="1E34F69E">
+          <wp:inline distT="0" distB="0" distL="0" distR="0" wp14:anchorId="461EA8E7" wp14:editId="54DC2285">
             <wp:extent cx="6645910" cy="3569335"/>
             <wp:effectExtent l="0" t="0" r="2540" b="0"/>
             <wp:docPr id="1007929458" name="Picture 1"/>
@@ -5492,6 +5382,9 @@
         </mc:AlternateContent>
       </w:r>
       <w:r>
+        <w:rPr>
+          <w:noProof/>
+        </w:rPr>
         <w:drawing>
           <wp:inline distT="0" distB="0" distL="0" distR="0" wp14:anchorId="4542DFD4" wp14:editId="594555FE">
             <wp:extent cx="6645910" cy="3623310"/>
@@ -5538,7 +5431,15 @@
         </w:numPr>
       </w:pPr>
       <w:r>
-        <w:t>File &gt; Export To Excel…</w:t>
+        <w:t xml:space="preserve">File &gt; Export </w:t>
+      </w:r>
+      <w:proofErr w:type="gramStart"/>
+      <w:r>
+        <w:t>To</w:t>
+      </w:r>
+      <w:proofErr w:type="gramEnd"/>
+      <w:r>
+        <w:t xml:space="preserve"> Excel…</w:t>
       </w:r>
     </w:p>
     <w:p>
@@ -5546,6 +5447,7 @@
         <w:rPr>
           <w:noProof/>
         </w:rPr>
+        <w:lastRenderedPageBreak/>
         <mc:AlternateContent>
           <mc:Choice Requires="wps">
             <w:drawing>
@@ -5626,6 +5528,9 @@
         </mc:AlternateContent>
       </w:r>
       <w:r>
+        <w:rPr>
+          <w:noProof/>
+        </w:rPr>
         <w:drawing>
           <wp:inline distT="0" distB="0" distL="0" distR="0" wp14:anchorId="7A271B75" wp14:editId="28BAD07D">
             <wp:extent cx="6645910" cy="687070"/>
@@ -5672,7 +5577,6 @@
         </w:numPr>
       </w:pPr>
       <w:r>
-        <w:lastRenderedPageBreak/>
         <w:t xml:space="preserve"> Important save the file name as shown in below</w:t>
       </w:r>
     </w:p>
@@ -5986,6 +5890,9 @@
         </mc:AlternateContent>
       </w:r>
       <w:r>
+        <w:rPr>
+          <w:noProof/>
+        </w:rPr>
         <w:drawing>
           <wp:inline distT="0" distB="0" distL="0" distR="0" wp14:anchorId="0F79CF46" wp14:editId="6C295306">
             <wp:extent cx="6645910" cy="3507740"/>
@@ -6032,13 +5939,7 @@
         </w:numPr>
       </w:pPr>
       <w:r>
-        <w:t xml:space="preserve"> Navigate to </w:t>
-      </w:r>
-      <w:r>
-        <w:t>Reports &gt; Reports &gt; Scheduling Reports</w:t>
-      </w:r>
-      <w:r>
-        <w:t xml:space="preserve"> &gt; Appointment Report</w:t>
+        <w:t xml:space="preserve"> Navigate to Reports &gt; Reports &gt; Scheduling Reports &gt; Appointment Report</w:t>
       </w:r>
     </w:p>
     <w:p>
@@ -6046,6 +5947,7 @@
         <w:rPr>
           <w:noProof/>
         </w:rPr>
+        <w:lastRenderedPageBreak/>
         <mc:AlternateContent>
           <mc:Choice Requires="wps">
             <w:drawing>
@@ -6206,6 +6108,9 @@
         </mc:AlternateContent>
       </w:r>
       <w:r>
+        <w:rPr>
+          <w:noProof/>
+        </w:rPr>
         <w:drawing>
           <wp:inline distT="0" distB="0" distL="0" distR="0" wp14:anchorId="05E2ED9E" wp14:editId="42EDA53E">
             <wp:extent cx="6645910" cy="3620770"/>
@@ -6252,7 +6157,6 @@
         </w:numPr>
       </w:pPr>
       <w:r>
-        <w:lastRenderedPageBreak/>
         <w:t xml:space="preserve"> Apply filter as shown below (Appointment Dates past 1 year), </w:t>
       </w:r>
       <w:r>
@@ -6267,6 +6171,7 @@
         <w:rPr>
           <w:noProof/>
         </w:rPr>
+        <w:lastRenderedPageBreak/>
         <mc:AlternateContent>
           <mc:Choice Requires="wps">
             <w:drawing>
@@ -6754,6 +6659,9 @@
         </mc:AlternateContent>
       </w:r>
       <w:r>
+        <w:rPr>
+          <w:noProof/>
+        </w:rPr>
         <w:drawing>
           <wp:inline distT="0" distB="0" distL="0" distR="0" wp14:anchorId="2E67AD82" wp14:editId="1D54367F">
             <wp:extent cx="6645910" cy="7032625"/>
@@ -6796,6 +6704,9 @@
     <w:p/>
     <w:p/>
     <w:p/>
+    <w:p/>
+    <w:p/>
+    <w:p/>
     <w:p>
       <w:pPr>
         <w:pStyle w:val="Heading2"/>
@@ -7148,6 +7059,9 @@
         </mc:AlternateContent>
       </w:r>
       <w:r>
+        <w:rPr>
+          <w:noProof/>
+        </w:rPr>
         <w:drawing>
           <wp:inline distT="0" distB="0" distL="0" distR="0" wp14:anchorId="26FC0AAA" wp14:editId="410BF170">
             <wp:extent cx="6645910" cy="3569970"/>
@@ -7362,6 +7276,9 @@
         </mc:AlternateContent>
       </w:r>
       <w:r>
+        <w:rPr>
+          <w:noProof/>
+        </w:rPr>
         <w:drawing>
           <wp:inline distT="0" distB="0" distL="0" distR="0" wp14:anchorId="6EC149B6" wp14:editId="6BD96472">
             <wp:extent cx="6645910" cy="3604260"/>
@@ -8069,6 +7986,9 @@
         </mc:AlternateContent>
       </w:r>
       <w:r>
+        <w:rPr>
+          <w:noProof/>
+        </w:rPr>
         <w:drawing>
           <wp:inline distT="0" distB="0" distL="0" distR="0" wp14:anchorId="3E194652" wp14:editId="4B4C4769">
             <wp:extent cx="6645910" cy="6275705"/>

</xml_diff>